<commit_message>
Reemplaza la app Streamlit por un aplicativo estatico que consume el modelo entrenado
El clasificador ya no vive server-side: train_model.py exporta los
parametros realmente ajustados (medianas de imputacion, media/desviacion
del escalado, coeficientes e intercepto) a app_web/modelo_potabilidad.js.
app_web/predictor.js es un motor de inferencia generico -no conoce los
nombres de las variables ni tiene coeficientes hardcodeados- que aplica
imputacion -> estandarizacion -> sigmoide a partir de ese archivo, y
app_web/index.html construye el formulario dinamicamente desde el mismo
modelo. Verificado contra la version Streamlit: misma probabilidad de
salida en los mismos casos de prueba.

Actualiza la portada y el informe para reflejar esta arquitectura.

Co-Authored-By: Claude Sonnet 5 <noreply@anthropic.com>
</commit_message>
<xml_diff>
--- a/TALLER 1.2/INFORME_POTABILIDAD_AGUA.docx
+++ b/TALLER 1.2/INFORME_POTABILIDAD_AGUA.docx
@@ -247,27 +247,16 @@
         <w:t>0.547</w:t>
       </w:r>
       <w:r>
-        <w:t xml:space="preserve">. Estos resultados —apenas superiores al azar— indican que las 9 variables disponibles tienen una relación muy débil, y probablemente no lineal, con la potabilidad real del agua. El modelo se empaquetó como un pipeline </w:t>
+        <w:t xml:space="preserve">. Estos resultados —apenas superiores al azar— indican que las 9 variables disponibles tienen una relación muy débil, y probablemente no lineal, con la potabilidad real del agua. El modelo entrenado (parámetros de imputación, escalado, coeficientes e intercepto) se exportó a un archivo de datos consumido por una página estática (HTML + JavaScript) que hace la clasificación </w:t>
       </w:r>
       <w:r>
         <w:rPr>
-          <w:rFonts w:ascii="Consolas" w:hAnsi="Consolas"/>
-          <w:sz w:val="19"/>
+          <w:b/>
         </w:rPr>
-        <w:t>scikit-learn</w:t>
+        <w:t>en el navegador</w:t>
       </w:r>
       <w:r>
-        <w:t xml:space="preserve"> serializado con </w:t>
-      </w:r>
-      <w:r>
-        <w:rPr>
-          <w:rFonts w:ascii="Consolas" w:hAnsi="Consolas"/>
-          <w:sz w:val="19"/>
-        </w:rPr>
-        <w:t>joblib</w:t>
-      </w:r>
-      <w:r>
-        <w:t xml:space="preserve"> y se expuso mediante una aplicación web interactiva construida con </w:t>
+        <w:t xml:space="preserve">, sin coeficientes escritos a mano en el cliente ni backend de por medio; adicionalmente se construyó una versión equivalente en </w:t>
       </w:r>
       <w:r>
         <w:rPr>
@@ -276,7 +265,7 @@
         <w:t>Streamlit</w:t>
       </w:r>
       <w:r>
-        <w:t>, lista para desplegarse en Streamlit Community Cloud.</w:t>
+        <w:t>, lista para desplegarse.</w:t>
       </w:r>
     </w:p>
     <w:p>
@@ -3320,6 +3309,29 @@
       </w:r>
     </w:p>
     <w:p>
+      <w:r>
+        <w:t xml:space="preserve">El aplicativo principal es una página estática (HTML + JavaScript puro) que clasifica </w:t>
+      </w:r>
+      <w:r>
+        <w:rPr>
+          <w:b/>
+        </w:rPr>
+        <w:t>en el navegador</w:t>
+      </w:r>
+      <w:r>
+        <w:t xml:space="preserve">, sin backend ni servidor de por medio. El punto clave de diseño es que el JavaScript </w:t>
+      </w:r>
+      <w:r>
+        <w:rPr>
+          <w:b/>
+        </w:rPr>
+        <w:t>no tiene la fórmula ni los coeficientes escritos a mano</w:t>
+      </w:r>
+      <w:r>
+        <w:t>: los lee de un archivo generado automáticamente por el entrenamiento.</w:t>
+      </w:r>
+    </w:p>
+    <w:p>
       <w:pPr>
         <w:ind w:left="283"/>
       </w:pPr>
@@ -3328,32 +3340,94 @@
           <w:rFonts w:ascii="Consolas" w:hAnsi="Consolas"/>
           <w:sz w:val="19"/>
         </w:rPr>
-        <w:t>Usuario (navegador)</w:t>
+        <w:t>train_model.py (Python / scikit-learn)</w:t>
         <w:br/>
-        <w:t xml:space="preserve">      │  completa 9 parámetros fisicoquímicos</w:t>
+        <w:t xml:space="preserve">      │  ajusta Imputer -&gt; StandardScaler -&gt; LogisticRegression</w:t>
+        <w:br/>
+        <w:t xml:space="preserve">      │  sobre el 80% de entrenamiento</w:t>
         <w:br/>
         <w:t xml:space="preserve">      ▼</w:t>
         <w:br/>
-        <w:t xml:space="preserve"> app.py (Streamlit)</w:t>
+        <w:t>app_web/modelo_potabilidad.js</w:t>
         <w:br/>
-        <w:t xml:space="preserve">      │  pipeline.predict_proba(X)</w:t>
+        <w:t xml:space="preserve">  (features, medianas de imputación, media/desviación del escalado,</w:t>
         <w:br/>
-        <w:t xml:space="preserve">      ▼</w:t>
+        <w:t xml:space="preserve">   coeficientes, intercepto y umbral -- todo como datos, generado por</w:t>
         <w:br/>
-        <w:t xml:space="preserve"> modelo_potabilidad.pkl</w:t>
-        <w:br/>
-        <w:t xml:space="preserve">  (Imputer → StandardScaler → LogisticRegression, serializado con joblib)</w:t>
+        <w:t xml:space="preserve">   el entrenamiento, cero valores hardcodeados en el cliente)</w:t>
         <w:br/>
         <w:t xml:space="preserve">      │</w:t>
         <w:br/>
         <w:t xml:space="preserve">      ▼</w:t>
         <w:br/>
-        <w:t xml:space="preserve"> Resultado: clase (Potable / No potable) + probabilidad</w:t>
+        <w:t>app_web/predictor.js  (motor de inferencia genérico)</w:t>
+        <w:br/>
+        <w:t xml:space="preserve">  predecir(valoresCrudos, modelo):</w:t>
+        <w:br/>
+        <w:t xml:space="preserve">    impute -&gt; estandariza -&gt; z = intercepto + Σ(coef·x) -&gt; sigmoide(z)</w:t>
+        <w:br/>
+        <w:t xml:space="preserve">      │</w:t>
+        <w:br/>
+        <w:t xml:space="preserve">      ▼</w:t>
+        <w:br/>
+        <w:t>app_web/index.html</w:t>
+        <w:br/>
+        <w:t xml:space="preserve">  construye el formulario dinámicamente a partir de modelo.features</w:t>
+        <w:br/>
+        <w:t xml:space="preserve">  y muestra clase (Potable / No potable) + probabilidad + el detalle</w:t>
+        <w:br/>
+        <w:t xml:space="preserve">  de cómo se calculó cada contribución</w:t>
       </w:r>
     </w:p>
     <w:p>
       <w:r>
-        <w:t xml:space="preserve">El modelo se entrena y evalúa en </w:t>
+        <w:rPr>
+          <w:rFonts w:ascii="Consolas" w:hAnsi="Consolas"/>
+          <w:sz w:val="19"/>
+        </w:rPr>
+        <w:t>predictor.js</w:t>
+      </w:r>
+      <w:r>
+        <w:t xml:space="preserve"> es </w:t>
+      </w:r>
+      <w:r>
+        <w:rPr>
+          <w:b/>
+        </w:rPr>
+        <w:t>independiente del dataset</w:t>
+      </w:r>
+      <w:r>
+        <w:t xml:space="preserve">: no menciona </w:t>
+      </w:r>
+      <w:r>
+        <w:rPr>
+          <w:rFonts w:ascii="Consolas" w:hAnsi="Consolas"/>
+          <w:sz w:val="19"/>
+        </w:rPr>
+        <w:t>ph</w:t>
+      </w:r>
+      <w:r>
+        <w:t xml:space="preserve">, </w:t>
+      </w:r>
+      <w:r>
+        <w:rPr>
+          <w:rFonts w:ascii="Consolas" w:hAnsi="Consolas"/>
+          <w:sz w:val="19"/>
+        </w:rPr>
+        <w:t>Solids</w:t>
+      </w:r>
+      <w:r>
+        <w:t xml:space="preserve"> ni ningún nombre de variable; simplemente recorre </w:t>
+      </w:r>
+      <w:r>
+        <w:rPr>
+          <w:rFonts w:ascii="Consolas" w:hAnsi="Consolas"/>
+          <w:sz w:val="19"/>
+        </w:rPr>
+        <w:t>modelo.features</w:t>
+      </w:r>
+      <w:r>
+        <w:t xml:space="preserve"> y aplica la misma transformación que usó </w:t>
       </w:r>
       <w:r>
         <w:rPr>
@@ -3363,7 +3437,61 @@
         <w:t>train_model.py</w:t>
       </w:r>
       <w:r>
-        <w:t xml:space="preserve">, que exporta </w:t>
+        <w:t xml:space="preserve">. Si el modelo se reentrena — con otras variables, otro dataset o mejores hiperparámetros — solo cambia </w:t>
+      </w:r>
+      <w:r>
+        <w:rPr>
+          <w:rFonts w:ascii="Consolas" w:hAnsi="Consolas"/>
+          <w:sz w:val="19"/>
+        </w:rPr>
+        <w:t>modelo_potabilidad.js</w:t>
+      </w:r>
+      <w:r>
+        <w:t xml:space="preserve">; ni </w:t>
+      </w:r>
+      <w:r>
+        <w:rPr>
+          <w:rFonts w:ascii="Consolas" w:hAnsi="Consolas"/>
+          <w:sz w:val="19"/>
+        </w:rPr>
+        <w:t>predictor.js</w:t>
+      </w:r>
+      <w:r>
+        <w:t xml:space="preserve"> ni </w:t>
+      </w:r>
+      <w:r>
+        <w:rPr>
+          <w:rFonts w:ascii="Consolas" w:hAnsi="Consolas"/>
+          <w:sz w:val="19"/>
+        </w:rPr>
+        <w:t>index.html</w:t>
+      </w:r>
+      <w:r>
+        <w:t xml:space="preserve"> necesitan tocarse.</w:t>
+      </w:r>
+    </w:p>
+    <w:p>
+      <w:r>
+        <w:t xml:space="preserve">Como alternativa server-side, también se construyó una versión en </w:t>
+      </w:r>
+      <w:r>
+        <w:rPr>
+          <w:b/>
+        </w:rPr>
+        <w:t>Streamlit</w:t>
+      </w:r>
+      <w:r>
+        <w:t xml:space="preserve"> (</w:t>
+      </w:r>
+      <w:r>
+        <w:rPr>
+          <w:rFonts w:ascii="Consolas" w:hAnsi="Consolas"/>
+          <w:sz w:val="19"/>
+        </w:rPr>
+        <w:t>app.py</w:t>
+      </w:r>
+      <w:r>
+        <w:t>) que carga el mismo pipeline serializado (</w:t>
       </w:r>
       <w:r>
         <w:rPr>
@@ -3373,27 +3501,7 @@
         <w:t>modelo_potabilidad.pkl</w:t>
       </w:r>
       <w:r>
-        <w:t xml:space="preserve"> (pipeline completo, autocontenido) y </w:t>
-      </w:r>
-      <w:r>
-        <w:rPr>
-          <w:rFonts w:ascii="Consolas" w:hAnsi="Consolas"/>
-          <w:sz w:val="19"/>
-        </w:rPr>
-        <w:t>resultados_metricas.json</w:t>
-      </w:r>
-      <w:r>
-        <w:t xml:space="preserve"> (métricas y metadatos que la app también consume para mostrar su propio desempeño). La aplicación </w:t>
-      </w:r>
-      <w:r>
-        <w:rPr>
-          <w:rFonts w:ascii="Consolas" w:hAnsi="Consolas"/>
-          <w:sz w:val="19"/>
-        </w:rPr>
-        <w:t>app.py</w:t>
-      </w:r>
-      <w:r>
-        <w:t xml:space="preserve"> es un frontend Streamlit sin estado de servidor adicional: cada predicción se calcula en el momento a partir del pipeline cargado en memoria.</w:t>
+        <w:t>, vía joblib) y ofrece la misma predicción desde Python; ambas implementaciones se verificaron numéricamente equivalentes (mismo caso de prueba, misma probabilidad de salida).</w:t>
       </w:r>
     </w:p>
     <w:p>
@@ -3409,7 +3517,17 @@
         <w:ind w:left="369" w:hanging="227"/>
       </w:pPr>
       <w:r>
-        <w:t>1. Abrir la URL pública de la aplicación (ver sección 6.3).</w:t>
+        <w:t xml:space="preserve">1. Abrir </w:t>
+      </w:r>
+      <w:r>
+        <w:rPr>
+          <w:rFonts w:ascii="Consolas" w:hAnsi="Consolas"/>
+          <w:sz w:val="19"/>
+        </w:rPr>
+        <w:t>app_web/index.html</w:t>
+      </w:r>
+      <w:r>
+        <w:t xml:space="preserve"> (o la URL pública una vez desplegada, ver sección 6.3).</w:t>
       </w:r>
     </w:p>
     <w:p>
@@ -3417,16 +3535,16 @@
         <w:ind w:left="369" w:hanging="227"/>
       </w:pPr>
       <w:r>
-        <w:t xml:space="preserve">2. En la pestaña </w:t>
+        <w:t xml:space="preserve">2. Completar los 9 campos con los parámetros fisicoquímicos de la muestra de agua, o presionar </w:t>
       </w:r>
       <w:r>
         <w:rPr>
           <w:b/>
         </w:rPr>
-        <w:t>"🔮 Predecir"</w:t>
+        <w:t>"Rellenar con medianas"</w:t>
       </w:r>
       <w:r>
-        <w:t>, completar los 9 campos con los parámetros fisicoquímicos de la muestra de agua (los campos vienen precargados con la mediana de cada variable como valor de referencia).</w:t>
+        <w:t xml:space="preserve"> para cargar valores de referencia del set de entrenamiento.</w:t>
       </w:r>
     </w:p>
     <w:p>
@@ -3451,39 +3569,39 @@
         <w:ind w:left="369" w:hanging="227"/>
       </w:pPr>
       <w:r>
-        <w:t>4. La aplicación muestra la clase predicha (✅ Potable / ⛔ No potable) junto con la probabilidad estimada.</w:t>
-      </w:r>
-    </w:p>
-    <w:p>
-      <w:pPr>
-        <w:ind w:left="369" w:hanging="227"/>
-      </w:pPr>
-      <w:r>
-        <w:t xml:space="preserve">5. En la pestaña </w:t>
+        <w:t xml:space="preserve">4. La página muestra la clase predicha (✅ Potable / ⛔ No potable), la probabilidad estimada y, en </w:t>
       </w:r>
       <w:r>
         <w:rPr>
           <w:b/>
         </w:rPr>
-        <w:t>"📊 Métricas del modelo"</w:t>
+        <w:t>"Ver cómo se calculó"</w:t>
       </w:r>
       <w:r>
-        <w:t xml:space="preserve"> puede consultarse el desempeño del modelo sobre el conjunto de prueba (accuracy, precision, recall, F1, AUC, matriz de confusión y coeficientes).</w:t>
+        <w:t>, el detalle de la contribución de cada variable a la predicción (transparencia sobre el cálculo, no es una caja negra).</w:t>
       </w:r>
     </w:p>
     <w:p>
       <w:r>
-        <w:t>La aplicación fue verificada localmente (</w:t>
+        <w:t xml:space="preserve">La aplicación fue verificada sirviéndola con un servidor estático local: con los valores por defecto (mediana de cada variable) predice </w:t>
       </w:r>
       <w:r>
         <w:rPr>
-          <w:rFonts w:ascii="Consolas" w:hAnsi="Consolas"/>
-          <w:sz w:val="19"/>
+          <w:b/>
         </w:rPr>
-        <w:t>streamlit run app.py</w:t>
+        <w:t>No potable, 49.8%</w:t>
       </w:r>
       <w:r>
-        <w:t>) con casos reales del dataset, incluyendo una muestra potable (predicha correctamente como Potable, 53.0% de probabilidad) y con los valores por defecto (mediana de cada variable, predicha como No potable, 49.8% de probabilidad).</w:t>
+        <w:t xml:space="preserve">, y con una muestra real potable del dataset predice </w:t>
+      </w:r>
+      <w:r>
+        <w:rPr>
+          <w:b/>
+        </w:rPr>
+        <w:t>Potable, 53.0%</w:t>
+      </w:r>
+      <w:r>
+        <w:t xml:space="preserve"> — ambos resultados idénticos a los que entrega la versión Streamlit sobre los mismos datos, confirmando que el motor de inferencia en JavaScript reproduce exactamente el pipeline entrenado en Python.</w:t>
       </w:r>
     </w:p>
     <w:p>
@@ -3514,36 +3632,16 @@
     </w:p>
     <w:p>
       <w:r>
-        <w:t xml:space="preserve">La aplicación está lista para desplegarse en </w:t>
+        <w:t xml:space="preserve">Al ser un sitio 100% estático (sin backend), el aplicativo puede publicarse en cualquier hosting gratuito sin necesidad de configurar un servidor: </w:t>
       </w:r>
       <w:r>
         <w:rPr>
           <w:b/>
         </w:rPr>
-        <w:t>Streamlit Community Cloud</w:t>
+        <w:t>GitHub Pages</w:t>
       </w:r>
       <w:r>
-        <w:t>, conectada al repositorio de GitHub (</w:t>
-      </w:r>
-      <w:r>
-        <w:rPr>
-          <w:rFonts w:ascii="Consolas" w:hAnsi="Consolas"/>
-          <w:sz w:val="19"/>
-        </w:rPr>
-        <w:t>requirements.txt</w:t>
-      </w:r>
-      <w:r>
-        <w:t xml:space="preserve"> y </w:t>
-      </w:r>
-      <w:r>
-        <w:rPr>
-          <w:rFonts w:ascii="Consolas" w:hAnsi="Consolas"/>
-          <w:sz w:val="19"/>
-        </w:rPr>
-        <w:t>app.py</w:t>
-      </w:r>
-      <w:r>
-        <w:t xml:space="preserve"> en </w:t>
+        <w:t xml:space="preserve"> (sirviendo la carpeta </w:t>
       </w:r>
       <w:r>
         <w:rPr>
@@ -3553,19 +3651,36 @@
         <w:t>TALLER 1.2/</w:t>
       </w:r>
       <w:r>
-        <w:t xml:space="preserve">). El despliegue queda pendiente de que el equipo conecte su cuenta de GitHub en </w:t>
+        <w:t xml:space="preserve"> o </w:t>
       </w:r>
-      <w:hyperlink r:id="rId19">
-        <w:r>
-          <w:rPr>
-            <w:color w:val="0563C1"/>
-            <w:u w:val="single"/>
-          </w:rPr>
-          <w:t>share.streamlit.io</w:t>
-        </w:r>
-      </w:hyperlink>
       <w:r>
-        <w:t>; una vez publicada, esta sección debe actualizarse con la URL final y capturas de pantalla de la versión en producción.</w:t>
+        <w:rPr>
+          <w:rFonts w:ascii="Consolas" w:hAnsi="Consolas"/>
+          <w:sz w:val="19"/>
+        </w:rPr>
+        <w:t>TALLER 1.2/app_web/</w:t>
+      </w:r>
+      <w:r>
+        <w:t xml:space="preserve"> del repositorio) o </w:t>
+      </w:r>
+      <w:r>
+        <w:rPr>
+          <w:b/>
+        </w:rPr>
+        <w:t>Netlify</w:t>
+      </w:r>
+      <w:r>
+        <w:t xml:space="preserve">, conectando el repositorio </w:t>
+      </w:r>
+      <w:r>
+        <w:rPr>
+          <w:rFonts w:ascii="Consolas" w:hAnsi="Consolas"/>
+          <w:sz w:val="19"/>
+        </w:rPr>
+        <w:t>JigSaw1117/CLAUDIOS</w:t>
+      </w:r>
+      <w:r>
+        <w:t>. El despliegue queda pendiente de que el equipo active alguna de estas opciones desde su propia cuenta; una vez publicada, esta sección debe actualizarse con la URL final y capturas de pantalla de la versión en producción.</w:t>
       </w:r>
     </w:p>
     <w:p>
@@ -3666,7 +3781,7 @@
       <w:r>
         <w:t xml:space="preserve"> </w:t>
       </w:r>
-      <w:hyperlink r:id="rId20">
+      <w:hyperlink r:id="rId19">
         <w:r>
           <w:rPr>
             <w:color w:val="0563C1"/>
@@ -3743,10 +3858,50 @@
           <w:rFonts w:ascii="Consolas" w:hAnsi="Consolas"/>
           <w:sz w:val="19"/>
         </w:rPr>
+        <w:t>app_web/</w:t>
+      </w:r>
+      <w:r>
+        <w:t xml:space="preserve"> (aplicativo estático: </w:t>
+      </w:r>
+      <w:r>
+        <w:rPr>
+          <w:rFonts w:ascii="Consolas" w:hAnsi="Consolas"/>
+          <w:sz w:val="19"/>
+        </w:rPr>
+        <w:t>index.html</w:t>
+      </w:r>
+      <w:r>
+        <w:t xml:space="preserve">, </w:t>
+      </w:r>
+      <w:r>
+        <w:rPr>
+          <w:rFonts w:ascii="Consolas" w:hAnsi="Consolas"/>
+          <w:sz w:val="19"/>
+        </w:rPr>
+        <w:t>predictor.js</w:t>
+      </w:r>
+      <w:r>
+        <w:t xml:space="preserve">, </w:t>
+      </w:r>
+      <w:r>
+        <w:rPr>
+          <w:rFonts w:ascii="Consolas" w:hAnsi="Consolas"/>
+          <w:sz w:val="19"/>
+        </w:rPr>
+        <w:t>modelo_potabilidad.js/.json</w:t>
+      </w:r>
+      <w:r>
+        <w:t xml:space="preserve">), </w:t>
+      </w:r>
+      <w:r>
+        <w:rPr>
+          <w:rFonts w:ascii="Consolas" w:hAnsi="Consolas"/>
+          <w:sz w:val="19"/>
+        </w:rPr>
         <w:t>app.py</w:t>
       </w:r>
       <w:r>
-        <w:t xml:space="preserve"> (aplicativo Streamlit), </w:t>
+        <w:t xml:space="preserve"> (aplicativo alternativo en Streamlit), </w:t>
       </w:r>
       <w:r>
         <w:rPr>
@@ -3756,7 +3911,7 @@
         <w:t>modelo_potabilidad.pkl</w:t>
       </w:r>
       <w:r>
-        <w:t xml:space="preserve"> (modelo serializado), </w:t>
+        <w:t xml:space="preserve"> (pipeline serializado), </w:t>
       </w:r>
       <w:r>
         <w:rPr>

</xml_diff>

<commit_message>
Termina el rename predecir->clasificar: referencias y verbos que faltaban
La busqueda anterior solo cubria el radical "predec", asi que se colaron
conjugaciones distintas:

- TALLER 1.2/index.html (portada): quedaba <predictor.js> en el texto
  descriptivo del boton, cuando el archivo real ya se llama
  clasificador.js.
- INFORME_POTABILIDAD_AGUA.md: "la clase predicha" -> "la clase asignada";
  "predice No potable/Potable" -> "clasifica como No potable/Potable".
- build_notebook.py (cuaderno reejecutado): "el modelo predice siempre la
  misma clase" -> "el modelo clasifica siempre en la misma clase".

Co-Authored-By: Claude Sonnet 5 <noreply@anthropic.com>
</commit_message>
<xml_diff>
--- a/TALLER 1.2/INFORME_POTABILIDAD_AGUA.docx
+++ b/TALLER 1.2/INFORME_POTABILIDAD_AGUA.docx
@@ -3569,7 +3569,7 @@
         <w:ind w:left="369" w:hanging="227"/>
       </w:pPr>
       <w:r>
-        <w:t xml:space="preserve">4. La página muestra la clase predicha (✅ Potable / ⛔ No potable), la probabilidad estimada y, en </w:t>
+        <w:t xml:space="preserve">4. La página muestra la clase asignada (✅ Potable / ⛔ No potable), la probabilidad estimada y, en </w:t>
       </w:r>
       <w:r>
         <w:rPr>
@@ -3583,7 +3583,7 @@
     </w:p>
     <w:p>
       <w:r>
-        <w:t xml:space="preserve">La aplicación fue verificada sirviéndola con un servidor estático local: con los valores por defecto (mediana de cada variable) predice </w:t>
+        <w:t xml:space="preserve">La aplicación fue verificada sirviéndola con un servidor estático local: con los valores por defecto (mediana de cada variable) clasifica como </w:t>
       </w:r>
       <w:r>
         <w:rPr>
@@ -3592,7 +3592,7 @@
         <w:t>No potable, 49.8%</w:t>
       </w:r>
       <w:r>
-        <w:t xml:space="preserve">, y con una muestra real potable del dataset predice </w:t>
+        <w:t xml:space="preserve">, y con una muestra real potable del dataset clasifica como </w:t>
       </w:r>
       <w:r>
         <w:rPr>

</xml_diff>